<commit_message>
Uploaded May lists. Added new list category Умершие в системе ГУЛАГа. Uploaded updated photos.
</commit_message>
<xml_diff>
--- a/docs/Выдержки-обвин.закл.-из-архивных-формуляров.docx
+++ b/docs/Выдержки-обвин.закл.-из-архивных-формуляров.docx
@@ -1250,27 +1250,7 @@
           <w:szCs w:val="16"/>
           <w:lang w:val="ru-RU"/>
         </w:rPr>
-        <w:t xml:space="preserve">.: по ст. </w:t>
-      </w:r>
-      <w:proofErr w:type="gramStart"/>
-      <w:r>
-        <w:rPr>
-          <w:rFonts w:ascii="Arial" w:hAnsi="Arial" w:cs="Arial"/>
-          <w:sz w:val="16"/>
-          <w:szCs w:val="16"/>
-          <w:lang w:val="ru-RU"/>
-        </w:rPr>
-        <w:t>58-10</w:t>
-      </w:r>
-      <w:proofErr w:type="gramEnd"/>
-      <w:r>
-        <w:rPr>
-          <w:rFonts w:ascii="Arial" w:hAnsi="Arial" w:cs="Arial"/>
-          <w:sz w:val="16"/>
-          <w:szCs w:val="16"/>
-          <w:lang w:val="ru-RU"/>
-        </w:rPr>
-        <w:t xml:space="preserve"> ч.2. Приговор: ВМН. Расстреляна 12 мая 1942 г.</w:t>
+        <w:t>.: по ст. 58-10 ч.2. Приговор: ВМН. Расстреляна 12 мая 1942 г.</w:t>
       </w:r>
     </w:p>
     <w:p>
@@ -6755,27 +6735,7 @@
           <w:szCs w:val="16"/>
           <w:lang w:val="ru-RU"/>
         </w:rPr>
-        <w:t xml:space="preserve"> в том, </w:t>
-      </w:r>
-      <w:proofErr w:type="gramStart"/>
-      <w:r>
-        <w:rPr>
-          <w:rFonts w:ascii="Arial" w:hAnsi="Arial" w:cs="Arial"/>
-          <w:sz w:val="16"/>
-          <w:szCs w:val="16"/>
-          <w:lang w:val="ru-RU"/>
-        </w:rPr>
-        <w:t>что</w:t>
-      </w:r>
-      <w:proofErr w:type="gramEnd"/>
-      <w:r>
-        <w:rPr>
-          <w:rFonts w:ascii="Arial" w:hAnsi="Arial" w:cs="Arial"/>
-          <w:sz w:val="16"/>
-          <w:szCs w:val="16"/>
-          <w:lang w:val="ru-RU"/>
-        </w:rPr>
-        <w:t xml:space="preserve"> присутствуя на собрании верующих по поводу изъятия церковных ценностей "выступила с речью, в которой призывала ценностей не отдавать, каковая речь принята была толпой собравшихся аплодисментами и криками "Ценностей не отдавать!"</w:t>
+        <w:t xml:space="preserve"> в том, что присутствуя на собрании верующих по поводу изъятия церковных ценностей "выступила с речью, в которой призывала ценностей не отдавать, каковая речь принята была толпой собравшихся аплодисментами и криками "Ценностей не отдавать!"</w:t>
       </w:r>
       <w:r>
         <w:rPr>
@@ -10410,27 +10370,7 @@
           <w:szCs w:val="16"/>
           <w:lang w:val="ru-RU"/>
         </w:rPr>
-        <w:t xml:space="preserve">.: по обвинению в "к/р агитации" (ст. </w:t>
-      </w:r>
-      <w:proofErr w:type="gramStart"/>
-      <w:r>
-        <w:rPr>
-          <w:rFonts w:ascii="Arial" w:hAnsi="Arial" w:cs="Arial"/>
-          <w:sz w:val="16"/>
-          <w:szCs w:val="16"/>
-          <w:lang w:val="ru-RU"/>
-        </w:rPr>
-        <w:t>58-14</w:t>
-      </w:r>
-      <w:proofErr w:type="gramEnd"/>
-      <w:r>
-        <w:rPr>
-          <w:rFonts w:ascii="Arial" w:hAnsi="Arial" w:cs="Arial"/>
-          <w:sz w:val="16"/>
-          <w:szCs w:val="16"/>
-          <w:lang w:val="ru-RU"/>
-        </w:rPr>
-        <w:t xml:space="preserve"> УК РСФСР). Приговор: к расстрелу</w:t>
+        <w:t>.: по обвинению в "к/р агитации" (ст. 58-14 УК РСФСР). Приговор: к расстрелу</w:t>
       </w:r>
     </w:p>
     <w:p>
@@ -11116,117 +11056,6 @@
           <w:szCs w:val="16"/>
           <w:lang w:val="ru-RU"/>
         </w:rPr>
-        <w:t>Арестована 21 июня 1938 г.</w:t>
-      </w:r>
-      <w:r>
-        <w:rPr>
-          <w:rFonts w:ascii="Arial" w:hAnsi="Arial" w:cs="Arial"/>
-          <w:sz w:val="16"/>
-          <w:szCs w:val="16"/>
-        </w:rPr>
-        <w:t> </w:t>
-      </w:r>
-      <w:r>
-        <w:rPr>
-          <w:rFonts w:ascii="Arial" w:hAnsi="Arial" w:cs="Arial"/>
-          <w:sz w:val="16"/>
-          <w:szCs w:val="16"/>
-          <w:lang w:val="ru-RU"/>
-        </w:rPr>
-        <w:t xml:space="preserve"> Приговорена: "тройка" 22 сентября 1938 г., </w:t>
-      </w:r>
-      <w:proofErr w:type="spellStart"/>
-      <w:r>
-        <w:rPr>
-          <w:rFonts w:ascii="Arial" w:hAnsi="Arial" w:cs="Arial"/>
-          <w:sz w:val="16"/>
-          <w:szCs w:val="16"/>
-          <w:lang w:val="ru-RU"/>
-        </w:rPr>
-        <w:t>обв</w:t>
-      </w:r>
-      <w:proofErr w:type="spellEnd"/>
-      <w:r>
-        <w:rPr>
-          <w:rFonts w:ascii="Arial" w:hAnsi="Arial" w:cs="Arial"/>
-          <w:sz w:val="16"/>
-          <w:szCs w:val="16"/>
-          <w:lang w:val="ru-RU"/>
-        </w:rPr>
-        <w:t>.:</w:t>
-      </w:r>
-      <w:r>
-        <w:rPr>
-          <w:rFonts w:ascii="Arial" w:hAnsi="Arial" w:cs="Arial"/>
-          <w:sz w:val="16"/>
-          <w:szCs w:val="16"/>
-        </w:rPr>
-        <w:t> </w:t>
-      </w:r>
-      <w:r>
-        <w:rPr>
-          <w:rFonts w:ascii="Arial" w:hAnsi="Arial" w:cs="Arial"/>
-          <w:sz w:val="16"/>
-          <w:szCs w:val="16"/>
-          <w:lang w:val="ru-RU"/>
-        </w:rPr>
-        <w:t>68 УК БССР - Шпионаж в пользу Польши.</w:t>
-      </w:r>
-      <w:r>
-        <w:rPr>
-          <w:rFonts w:ascii="Arial" w:hAnsi="Arial" w:cs="Arial"/>
-          <w:sz w:val="16"/>
-          <w:szCs w:val="16"/>
-        </w:rPr>
-        <w:t> </w:t>
-      </w:r>
-      <w:r>
-        <w:rPr>
-          <w:rFonts w:ascii="Arial" w:hAnsi="Arial" w:cs="Arial"/>
-          <w:sz w:val="16"/>
-          <w:szCs w:val="16"/>
-          <w:lang w:val="ru-RU"/>
-        </w:rPr>
-        <w:t>Приговор: ВМН Расстреляна 26 сентября 1938 г.</w:t>
-      </w:r>
-    </w:p>
-    <w:p>
-      <w:pPr>
-        <w:spacing w:after="0" w:line="240" w:lineRule="auto"/>
-        <w:rPr>
-          <w:rFonts w:ascii="Arial" w:hAnsi="Arial" w:cs="Arial"/>
-          <w:sz w:val="16"/>
-          <w:szCs w:val="16"/>
-          <w:lang w:val="ru-RU"/>
-        </w:rPr>
-      </w:pPr>
-      <w:r>
-        <w:rPr>
-          <w:rFonts w:ascii="Arial" w:hAnsi="Arial" w:cs="Arial"/>
-          <w:sz w:val="16"/>
-          <w:szCs w:val="16"/>
-          <w:lang w:val="ru-RU"/>
-        </w:rPr>
-        <w:t>--------------------------------------------------------------</w:t>
-      </w:r>
-    </w:p>
-    <w:p>
-      <w:pPr>
-        <w:spacing w:after="0" w:line="240" w:lineRule="auto"/>
-        <w:rPr>
-          <w:rFonts w:ascii="Arial" w:hAnsi="Arial" w:cs="Arial"/>
-          <w:sz w:val="16"/>
-          <w:szCs w:val="16"/>
-          <w:lang w:val="ru-RU"/>
-        </w:rPr>
-      </w:pPr>
-      <w:r>
-        <w:rPr>
-          <w:rFonts w:ascii="Arial" w:hAnsi="Arial" w:cs="Arial"/>
-          <w:sz w:val="16"/>
-          <w:szCs w:val="16"/>
-          <w:lang w:val="ru-RU"/>
-        </w:rPr>
         <w:t xml:space="preserve">Арестованная 15 декабря 1937 г., Обвинение по ст. 54-1а УК Украинская ССР. По указу НКВД СССР и Прокурора СССР от 7 января 1938 </w:t>
       </w:r>
       <w:proofErr w:type="gramStart"/>
@@ -12954,6 +12783,93 @@
           <w:szCs w:val="16"/>
           <w:lang w:val="ru-RU"/>
         </w:rPr>
+        <w:t>--------------------------------------------------------------</w:t>
+      </w:r>
+    </w:p>
+    <w:p>
+      <w:pPr>
+        <w:spacing w:after="0" w:line="240" w:lineRule="auto"/>
+        <w:rPr>
+          <w:rFonts w:ascii="Arial" w:hAnsi="Arial" w:cs="Arial"/>
+          <w:sz w:val="16"/>
+          <w:szCs w:val="16"/>
+          <w:lang w:val="ru-RU"/>
+        </w:rPr>
+      </w:pPr>
+      <w:r>
+        <w:rPr>
+          <w:rFonts w:ascii="Arial" w:hAnsi="Arial" w:cs="Arial"/>
+          <w:sz w:val="16"/>
+          <w:szCs w:val="16"/>
+          <w:lang w:val="ru-RU"/>
+        </w:rPr>
+        <w:t xml:space="preserve">Арестована 6 марта 1941 г.  Приговорена: Омский облсуд 26 декабря 1941 г., </w:t>
+      </w:r>
+      <w:proofErr w:type="spellStart"/>
+      <w:r>
+        <w:rPr>
+          <w:rFonts w:ascii="Arial" w:hAnsi="Arial" w:cs="Arial"/>
+          <w:sz w:val="16"/>
+          <w:szCs w:val="16"/>
+          <w:lang w:val="ru-RU"/>
+        </w:rPr>
+        <w:t>обв</w:t>
+      </w:r>
+      <w:proofErr w:type="spellEnd"/>
+      <w:r>
+        <w:rPr>
+          <w:rFonts w:ascii="Arial" w:hAnsi="Arial" w:cs="Arial"/>
+          <w:sz w:val="16"/>
+          <w:szCs w:val="16"/>
+          <w:lang w:val="ru-RU"/>
+        </w:rPr>
+        <w:t>.:</w:t>
+      </w:r>
+      <w:r>
+        <w:rPr>
+          <w:rFonts w:ascii="Arial" w:hAnsi="Arial" w:cs="Arial"/>
+          <w:sz w:val="16"/>
+          <w:szCs w:val="16"/>
+        </w:rPr>
+        <w:t> </w:t>
+      </w:r>
+      <w:r>
+        <w:rPr>
+          <w:rFonts w:ascii="Arial" w:hAnsi="Arial" w:cs="Arial"/>
+          <w:sz w:val="16"/>
+          <w:szCs w:val="16"/>
+          <w:lang w:val="ru-RU"/>
+        </w:rPr>
+        <w:t>по ст. 19-58-8 УК РСФСР.</w:t>
+      </w:r>
+      <w:r>
+        <w:rPr>
+          <w:rFonts w:ascii="Arial" w:hAnsi="Arial" w:cs="Arial"/>
+          <w:sz w:val="16"/>
+          <w:szCs w:val="16"/>
+          <w:lang w:val="ru-RU"/>
+        </w:rPr>
+        <w:br/>
+        <w:t>Приговор: ВМН. Реабилитирована 29 января 1991 г.</w:t>
+      </w:r>
+    </w:p>
+    <w:p>
+      <w:pPr>
+        <w:spacing w:after="0" w:line="240" w:lineRule="auto"/>
+        <w:rPr>
+          <w:rFonts w:ascii="Arial" w:hAnsi="Arial" w:cs="Arial"/>
+          <w:sz w:val="16"/>
+          <w:szCs w:val="16"/>
+          <w:lang w:val="ru-RU"/>
+        </w:rPr>
+      </w:pPr>
+      <w:r>
+        <w:rPr>
+          <w:rFonts w:ascii="Arial" w:hAnsi="Arial" w:cs="Arial"/>
+          <w:sz w:val="16"/>
+          <w:szCs w:val="16"/>
+          <w:lang w:val="ru-RU"/>
+        </w:rPr>
         <w:lastRenderedPageBreak/>
         <w:t>--------------------------------------------------------------</w:t>
       </w:r>
@@ -12962,25 +12878,79 @@
       <w:pPr>
         <w:spacing w:after="0" w:line="240" w:lineRule="auto"/>
         <w:rPr>
-          <w:rFonts w:ascii="Arial" w:hAnsi="Arial" w:cs="Arial"/>
-          <w:sz w:val="16"/>
-          <w:szCs w:val="16"/>
-          <w:lang w:val="ru-RU"/>
-        </w:rPr>
-      </w:pPr>
-      <w:r>
-        <w:rPr>
-          <w:rFonts w:ascii="Arial" w:hAnsi="Arial" w:cs="Arial"/>
-          <w:sz w:val="16"/>
-          <w:szCs w:val="16"/>
-          <w:lang w:val="ru-RU"/>
-        </w:rPr>
-        <w:t xml:space="preserve">Арестована 6 марта 1941 г.  Приговорена: Омский облсуд 26 декабря 1941 г., </w:t>
+          <w:rFonts w:ascii="Arial" w:eastAsia="Arial" w:hAnsi="Arial" w:cs="Arial"/>
+          <w:sz w:val="16"/>
+          <w:szCs w:val="16"/>
+          <w:lang w:val="ru-RU"/>
+        </w:rPr>
+      </w:pPr>
+      <w:proofErr w:type="gramStart"/>
+      <w:r>
+        <w:rPr>
+          <w:rFonts w:ascii="Arial" w:eastAsia="Arial" w:hAnsi="Arial" w:cs="Arial"/>
+          <w:sz w:val="16"/>
+          <w:szCs w:val="16"/>
+          <w:lang w:val="ru-RU"/>
+        </w:rPr>
+        <w:t>Расстреляна  26.06.1941</w:t>
+      </w:r>
+      <w:proofErr w:type="gramEnd"/>
+      <w:r>
+        <w:rPr>
+          <w:rFonts w:ascii="Arial" w:eastAsia="Arial" w:hAnsi="Arial" w:cs="Arial"/>
+          <w:sz w:val="16"/>
+          <w:szCs w:val="16"/>
+          <w:lang w:val="ru-RU"/>
+        </w:rPr>
+        <w:t xml:space="preserve"> года в Львовской тюрьме. Список № 1 (№ 62)</w:t>
+      </w:r>
+    </w:p>
+    <w:p>
+      <w:pPr>
+        <w:spacing w:after="0" w:line="240" w:lineRule="auto"/>
+        <w:rPr>
+          <w:rFonts w:ascii="Arial" w:hAnsi="Arial" w:cs="Arial"/>
+          <w:sz w:val="16"/>
+          <w:szCs w:val="16"/>
+          <w:lang w:val="ru-RU"/>
+        </w:rPr>
+      </w:pPr>
+      <w:r>
+        <w:rPr>
+          <w:rFonts w:ascii="Arial" w:hAnsi="Arial" w:cs="Arial"/>
+          <w:sz w:val="16"/>
+          <w:szCs w:val="16"/>
+          <w:lang w:val="ru-RU"/>
+        </w:rPr>
+        <w:t>--------------------------------------------------------------</w:t>
+      </w:r>
+    </w:p>
+    <w:p>
+      <w:pPr>
+        <w:spacing w:after="0" w:line="240" w:lineRule="auto"/>
+        <w:rPr>
+          <w:rFonts w:ascii="Arial" w:hAnsi="Arial" w:cs="Arial"/>
+          <w:color w:val="000000"/>
+          <w:sz w:val="16"/>
+          <w:szCs w:val="16"/>
+          <w:lang w:val="ru-RU"/>
+        </w:rPr>
+      </w:pPr>
+      <w:r>
+        <w:rPr>
+          <w:rFonts w:ascii="Arial" w:hAnsi="Arial" w:cs="Arial"/>
+          <w:color w:val="000000"/>
+          <w:sz w:val="16"/>
+          <w:szCs w:val="16"/>
+          <w:lang w:val="ru-RU"/>
+        </w:rPr>
+        <w:t xml:space="preserve">Приговорена: ВК ВС СССР (заочно, по указанию ГКО от 6.09.1941, подписанному Сталиным) 8 сентября 1941 г., </w:t>
       </w:r>
       <w:proofErr w:type="spellStart"/>
       <w:r>
         <w:rPr>
           <w:rFonts w:ascii="Arial" w:hAnsi="Arial" w:cs="Arial"/>
+          <w:color w:val="000000"/>
           <w:sz w:val="16"/>
           <w:szCs w:val="16"/>
           <w:lang w:val="ru-RU"/>
@@ -12991,6 +12961,7 @@
       <w:r>
         <w:rPr>
           <w:rFonts w:ascii="Arial" w:hAnsi="Arial" w:cs="Arial"/>
+          <w:color w:val="000000"/>
           <w:sz w:val="16"/>
           <w:szCs w:val="16"/>
           <w:lang w:val="ru-RU"/>
@@ -13000,6 +12971,7 @@
       <w:r>
         <w:rPr>
           <w:rFonts w:ascii="Arial" w:hAnsi="Arial" w:cs="Arial"/>
+          <w:color w:val="000000"/>
           <w:sz w:val="16"/>
           <w:szCs w:val="16"/>
         </w:rPr>
@@ -13008,105 +12980,14 @@
       <w:r>
         <w:rPr>
           <w:rFonts w:ascii="Arial" w:hAnsi="Arial" w:cs="Arial"/>
-          <w:sz w:val="16"/>
-          <w:szCs w:val="16"/>
-          <w:lang w:val="ru-RU"/>
-        </w:rPr>
-        <w:t>по ст. 19-58-8 УК РСФСР.</w:t>
-      </w:r>
-      <w:r>
-        <w:rPr>
-          <w:rFonts w:ascii="Arial" w:hAnsi="Arial" w:cs="Arial"/>
-          <w:sz w:val="16"/>
-          <w:szCs w:val="16"/>
-          <w:lang w:val="ru-RU"/>
-        </w:rPr>
-        <w:br/>
-        <w:t>Приговор: ВМН. Реабилитирована 29 января 1991 г.</w:t>
-      </w:r>
-    </w:p>
-    <w:p>
-      <w:pPr>
-        <w:spacing w:after="0" w:line="240" w:lineRule="auto"/>
-        <w:rPr>
-          <w:rFonts w:ascii="Arial" w:hAnsi="Arial" w:cs="Arial"/>
-          <w:sz w:val="16"/>
-          <w:szCs w:val="16"/>
-          <w:lang w:val="ru-RU"/>
-        </w:rPr>
-      </w:pPr>
-      <w:r>
-        <w:rPr>
-          <w:rFonts w:ascii="Arial" w:hAnsi="Arial" w:cs="Arial"/>
-          <w:sz w:val="16"/>
-          <w:szCs w:val="16"/>
-          <w:lang w:val="ru-RU"/>
-        </w:rPr>
-        <w:t>--------------------------------------------------------------</w:t>
-      </w:r>
-    </w:p>
-    <w:p>
-      <w:pPr>
-        <w:spacing w:after="0" w:line="240" w:lineRule="auto"/>
-        <w:rPr>
-          <w:rFonts w:ascii="Arial" w:eastAsia="Arial" w:hAnsi="Arial" w:cs="Arial"/>
-          <w:sz w:val="16"/>
-          <w:szCs w:val="16"/>
-          <w:lang w:val="ru-RU"/>
-        </w:rPr>
-      </w:pPr>
-      <w:proofErr w:type="gramStart"/>
-      <w:r>
-        <w:rPr>
-          <w:rFonts w:ascii="Arial" w:eastAsia="Arial" w:hAnsi="Arial" w:cs="Arial"/>
-          <w:sz w:val="16"/>
-          <w:szCs w:val="16"/>
-          <w:lang w:val="ru-RU"/>
-        </w:rPr>
-        <w:t>Расстреляна  26.06.1941</w:t>
-      </w:r>
-      <w:proofErr w:type="gramEnd"/>
-      <w:r>
-        <w:rPr>
-          <w:rFonts w:ascii="Arial" w:eastAsia="Arial" w:hAnsi="Arial" w:cs="Arial"/>
-          <w:sz w:val="16"/>
-          <w:szCs w:val="16"/>
-          <w:lang w:val="ru-RU"/>
-        </w:rPr>
-        <w:t xml:space="preserve"> года в Львовской тюрьме. Список № 1 (№ 62)</w:t>
-      </w:r>
-    </w:p>
-    <w:p>
-      <w:pPr>
-        <w:spacing w:after="0" w:line="240" w:lineRule="auto"/>
-        <w:rPr>
-          <w:rFonts w:ascii="Arial" w:hAnsi="Arial" w:cs="Arial"/>
-          <w:sz w:val="16"/>
-          <w:szCs w:val="16"/>
-          <w:lang w:val="ru-RU"/>
-        </w:rPr>
-      </w:pPr>
-      <w:r>
-        <w:rPr>
-          <w:rFonts w:ascii="Arial" w:hAnsi="Arial" w:cs="Arial"/>
-          <w:sz w:val="16"/>
-          <w:szCs w:val="16"/>
-          <w:lang w:val="ru-RU"/>
-        </w:rPr>
-        <w:t>--------------------------------------------------------------</w:t>
-      </w:r>
-    </w:p>
-    <w:p>
-      <w:pPr>
-        <w:spacing w:after="0" w:line="240" w:lineRule="auto"/>
-        <w:rPr>
-          <w:rFonts w:ascii="Arial" w:hAnsi="Arial" w:cs="Arial"/>
           <w:color w:val="000000"/>
           <w:sz w:val="16"/>
           <w:szCs w:val="16"/>
           <w:lang w:val="ru-RU"/>
         </w:rPr>
-      </w:pPr>
+        <w:t xml:space="preserve">58-10, ч.2 (антисоветская агитация, </w:t>
+      </w:r>
+      <w:proofErr w:type="spellStart"/>
       <w:r>
         <w:rPr>
           <w:rFonts w:ascii="Arial" w:hAnsi="Arial" w:cs="Arial"/>
@@ -13115,7 +12996,18 @@
           <w:szCs w:val="16"/>
           <w:lang w:val="ru-RU"/>
         </w:rPr>
-        <w:t xml:space="preserve">Приговорена: ВК ВС СССР (заочно, по указанию ГКО от 6.09.1941, подписанному Сталиным) 8 сентября 1941 г., </w:t>
+        <w:t>распр-ие</w:t>
+      </w:r>
+      <w:proofErr w:type="spellEnd"/>
+      <w:r>
+        <w:rPr>
+          <w:rFonts w:ascii="Arial" w:hAnsi="Arial" w:cs="Arial"/>
+          <w:color w:val="000000"/>
+          <w:sz w:val="16"/>
+          <w:szCs w:val="16"/>
+          <w:lang w:val="ru-RU"/>
+        </w:rPr>
+        <w:t xml:space="preserve"> </w:t>
       </w:r>
       <w:proofErr w:type="spellStart"/>
       <w:r>
@@ -13126,86 +13018,9 @@
           <w:szCs w:val="16"/>
           <w:lang w:val="ru-RU"/>
         </w:rPr>
-        <w:t>обв</w:t>
+        <w:t>клеветнич.измышлений</w:t>
       </w:r>
       <w:proofErr w:type="spellEnd"/>
-      <w:r>
-        <w:rPr>
-          <w:rFonts w:ascii="Arial" w:hAnsi="Arial" w:cs="Arial"/>
-          <w:color w:val="000000"/>
-          <w:sz w:val="16"/>
-          <w:szCs w:val="16"/>
-          <w:lang w:val="ru-RU"/>
-        </w:rPr>
-        <w:t>.:</w:t>
-      </w:r>
-      <w:r>
-        <w:rPr>
-          <w:rFonts w:ascii="Arial" w:hAnsi="Arial" w:cs="Arial"/>
-          <w:color w:val="000000"/>
-          <w:sz w:val="16"/>
-          <w:szCs w:val="16"/>
-        </w:rPr>
-        <w:t> </w:t>
-      </w:r>
-      <w:proofErr w:type="gramStart"/>
-      <w:r>
-        <w:rPr>
-          <w:rFonts w:ascii="Arial" w:hAnsi="Arial" w:cs="Arial"/>
-          <w:color w:val="000000"/>
-          <w:sz w:val="16"/>
-          <w:szCs w:val="16"/>
-          <w:lang w:val="ru-RU"/>
-        </w:rPr>
-        <w:t>58-10</w:t>
-      </w:r>
-      <w:proofErr w:type="gramEnd"/>
-      <w:r>
-        <w:rPr>
-          <w:rFonts w:ascii="Arial" w:hAnsi="Arial" w:cs="Arial"/>
-          <w:color w:val="000000"/>
-          <w:sz w:val="16"/>
-          <w:szCs w:val="16"/>
-          <w:lang w:val="ru-RU"/>
-        </w:rPr>
-        <w:t xml:space="preserve">, ч.2 (антисоветская агитация, </w:t>
-      </w:r>
-      <w:proofErr w:type="spellStart"/>
-      <w:r>
-        <w:rPr>
-          <w:rFonts w:ascii="Arial" w:hAnsi="Arial" w:cs="Arial"/>
-          <w:color w:val="000000"/>
-          <w:sz w:val="16"/>
-          <w:szCs w:val="16"/>
-          <w:lang w:val="ru-RU"/>
-        </w:rPr>
-        <w:t>распр-ие</w:t>
-      </w:r>
-      <w:proofErr w:type="spellEnd"/>
-      <w:r>
-        <w:rPr>
-          <w:rFonts w:ascii="Arial" w:hAnsi="Arial" w:cs="Arial"/>
-          <w:color w:val="000000"/>
-          <w:sz w:val="16"/>
-          <w:szCs w:val="16"/>
-          <w:lang w:val="ru-RU"/>
-        </w:rPr>
-        <w:t xml:space="preserve"> </w:t>
-      </w:r>
-      <w:proofErr w:type="spellStart"/>
-      <w:proofErr w:type="gramStart"/>
-      <w:r>
-        <w:rPr>
-          <w:rFonts w:ascii="Arial" w:hAnsi="Arial" w:cs="Arial"/>
-          <w:color w:val="000000"/>
-          <w:sz w:val="16"/>
-          <w:szCs w:val="16"/>
-          <w:lang w:val="ru-RU"/>
-        </w:rPr>
-        <w:t>клеветнич.измышлений</w:t>
-      </w:r>
-      <w:proofErr w:type="spellEnd"/>
-      <w:proofErr w:type="gramEnd"/>
       <w:r>
         <w:rPr>
           <w:rFonts w:ascii="Arial" w:hAnsi="Arial" w:cs="Arial"/>
@@ -15036,110 +14851,110 @@
           <w:szCs w:val="16"/>
           <w:lang w:val="ru-RU"/>
         </w:rPr>
+        <w:t xml:space="preserve">Арестована 25 февраля 1950 г.  Приговорена: ВТ в/ч 48240 18 августа 1950 г., </w:t>
+      </w:r>
+      <w:proofErr w:type="spellStart"/>
+      <w:r>
+        <w:rPr>
+          <w:rFonts w:ascii="Arial" w:hAnsi="Arial" w:cs="Arial"/>
+          <w:color w:val="000000"/>
+          <w:sz w:val="16"/>
+          <w:szCs w:val="16"/>
+          <w:lang w:val="ru-RU"/>
+        </w:rPr>
+        <w:t>обв</w:t>
+      </w:r>
+      <w:proofErr w:type="spellEnd"/>
+      <w:r>
+        <w:rPr>
+          <w:rFonts w:ascii="Arial" w:hAnsi="Arial" w:cs="Arial"/>
+          <w:color w:val="000000"/>
+          <w:sz w:val="16"/>
+          <w:szCs w:val="16"/>
+          <w:lang w:val="ru-RU"/>
+        </w:rPr>
+        <w:t>.:</w:t>
+      </w:r>
+      <w:r>
+        <w:rPr>
+          <w:rFonts w:ascii="Arial" w:hAnsi="Arial" w:cs="Arial"/>
+          <w:color w:val="000000"/>
+          <w:sz w:val="16"/>
+          <w:szCs w:val="16"/>
+        </w:rPr>
+        <w:t> </w:t>
+      </w:r>
+      <w:r>
+        <w:rPr>
+          <w:rFonts w:ascii="Arial" w:hAnsi="Arial" w:cs="Arial"/>
+          <w:color w:val="000000"/>
+          <w:sz w:val="16"/>
+          <w:szCs w:val="16"/>
+          <w:lang w:val="ru-RU"/>
+        </w:rPr>
+        <w:t xml:space="preserve">сотрудничестве с английской </w:t>
+      </w:r>
+      <w:proofErr w:type="gramStart"/>
+      <w:r>
+        <w:rPr>
+          <w:rFonts w:ascii="Arial" w:hAnsi="Arial" w:cs="Arial"/>
+          <w:color w:val="000000"/>
+          <w:sz w:val="16"/>
+          <w:szCs w:val="16"/>
+          <w:lang w:val="ru-RU"/>
+        </w:rPr>
+        <w:t>разведкой..</w:t>
+      </w:r>
+      <w:proofErr w:type="gramEnd"/>
+      <w:r>
+        <w:rPr>
+          <w:rFonts w:ascii="Arial" w:hAnsi="Arial" w:cs="Arial"/>
+          <w:color w:val="000000"/>
+          <w:sz w:val="16"/>
+          <w:szCs w:val="16"/>
+          <w:lang w:val="ru-RU"/>
+        </w:rPr>
+        <w:t xml:space="preserve">  Расстреляна 9 ноября 1950 г. Место захоронения – Москва</w:t>
+      </w:r>
+    </w:p>
+    <w:p>
+      <w:pPr>
+        <w:spacing w:after="0" w:line="240" w:lineRule="auto"/>
+        <w:rPr>
+          <w:rFonts w:ascii="Arial" w:hAnsi="Arial" w:cs="Arial"/>
+          <w:sz w:val="16"/>
+          <w:szCs w:val="16"/>
+          <w:lang w:val="ru-RU"/>
+        </w:rPr>
+      </w:pPr>
+      <w:r>
+        <w:rPr>
+          <w:rFonts w:ascii="Arial" w:hAnsi="Arial" w:cs="Arial"/>
+          <w:sz w:val="16"/>
+          <w:szCs w:val="16"/>
+          <w:lang w:val="ru-RU"/>
+        </w:rPr>
+        <w:t>--------------------------------------------------------------</w:t>
+      </w:r>
+    </w:p>
+    <w:p>
+      <w:pPr>
+        <w:spacing w:after="0" w:line="240" w:lineRule="auto"/>
+        <w:rPr>
+          <w:rFonts w:ascii="Arial" w:hAnsi="Arial" w:cs="Arial"/>
+          <w:sz w:val="16"/>
+          <w:szCs w:val="16"/>
+          <w:lang w:val="ru-RU"/>
+        </w:rPr>
+      </w:pPr>
+      <w:r>
+        <w:rPr>
+          <w:rFonts w:ascii="Arial" w:hAnsi="Arial" w:cs="Arial"/>
+          <w:sz w:val="16"/>
+          <w:szCs w:val="16"/>
+          <w:lang w:val="ru-RU"/>
+        </w:rPr>
         <w:lastRenderedPageBreak/>
-        <w:t xml:space="preserve">Арестована 25 февраля 1950 г.  Приговорена: ВТ в/ч 48240 18 августа 1950 г., </w:t>
-      </w:r>
-      <w:proofErr w:type="spellStart"/>
-      <w:r>
-        <w:rPr>
-          <w:rFonts w:ascii="Arial" w:hAnsi="Arial" w:cs="Arial"/>
-          <w:color w:val="000000"/>
-          <w:sz w:val="16"/>
-          <w:szCs w:val="16"/>
-          <w:lang w:val="ru-RU"/>
-        </w:rPr>
-        <w:t>обв</w:t>
-      </w:r>
-      <w:proofErr w:type="spellEnd"/>
-      <w:r>
-        <w:rPr>
-          <w:rFonts w:ascii="Arial" w:hAnsi="Arial" w:cs="Arial"/>
-          <w:color w:val="000000"/>
-          <w:sz w:val="16"/>
-          <w:szCs w:val="16"/>
-          <w:lang w:val="ru-RU"/>
-        </w:rPr>
-        <w:t>.:</w:t>
-      </w:r>
-      <w:r>
-        <w:rPr>
-          <w:rFonts w:ascii="Arial" w:hAnsi="Arial" w:cs="Arial"/>
-          <w:color w:val="000000"/>
-          <w:sz w:val="16"/>
-          <w:szCs w:val="16"/>
-        </w:rPr>
-        <w:t> </w:t>
-      </w:r>
-      <w:r>
-        <w:rPr>
-          <w:rFonts w:ascii="Arial" w:hAnsi="Arial" w:cs="Arial"/>
-          <w:color w:val="000000"/>
-          <w:sz w:val="16"/>
-          <w:szCs w:val="16"/>
-          <w:lang w:val="ru-RU"/>
-        </w:rPr>
-        <w:t xml:space="preserve">сотрудничестве с английской </w:t>
-      </w:r>
-      <w:proofErr w:type="gramStart"/>
-      <w:r>
-        <w:rPr>
-          <w:rFonts w:ascii="Arial" w:hAnsi="Arial" w:cs="Arial"/>
-          <w:color w:val="000000"/>
-          <w:sz w:val="16"/>
-          <w:szCs w:val="16"/>
-          <w:lang w:val="ru-RU"/>
-        </w:rPr>
-        <w:t>разведкой..</w:t>
-      </w:r>
-      <w:proofErr w:type="gramEnd"/>
-      <w:r>
-        <w:rPr>
-          <w:rFonts w:ascii="Arial" w:hAnsi="Arial" w:cs="Arial"/>
-          <w:color w:val="000000"/>
-          <w:sz w:val="16"/>
-          <w:szCs w:val="16"/>
-          <w:lang w:val="ru-RU"/>
-        </w:rPr>
-        <w:t xml:space="preserve">  Расстреляна 9 ноября 1950 г. Место захоронения – Москва</w:t>
-      </w:r>
-    </w:p>
-    <w:p>
-      <w:pPr>
-        <w:spacing w:after="0" w:line="240" w:lineRule="auto"/>
-        <w:rPr>
-          <w:rFonts w:ascii="Arial" w:hAnsi="Arial" w:cs="Arial"/>
-          <w:sz w:val="16"/>
-          <w:szCs w:val="16"/>
-          <w:lang w:val="ru-RU"/>
-        </w:rPr>
-      </w:pPr>
-      <w:r>
-        <w:rPr>
-          <w:rFonts w:ascii="Arial" w:hAnsi="Arial" w:cs="Arial"/>
-          <w:sz w:val="16"/>
-          <w:szCs w:val="16"/>
-          <w:lang w:val="ru-RU"/>
-        </w:rPr>
-        <w:t>--------------------------------------------------------------</w:t>
-      </w:r>
-    </w:p>
-    <w:p>
-      <w:pPr>
-        <w:spacing w:after="0" w:line="240" w:lineRule="auto"/>
-        <w:rPr>
-          <w:rFonts w:ascii="Arial" w:hAnsi="Arial" w:cs="Arial"/>
-          <w:sz w:val="16"/>
-          <w:szCs w:val="16"/>
-          <w:lang w:val="ru-RU"/>
-        </w:rPr>
-      </w:pPr>
-      <w:r>
-        <w:rPr>
-          <w:rFonts w:ascii="Arial" w:hAnsi="Arial" w:cs="Arial"/>
-          <w:sz w:val="16"/>
-          <w:szCs w:val="16"/>
-          <w:lang w:val="ru-RU"/>
-        </w:rPr>
         <w:t xml:space="preserve">Арестована 12 февраля 1951 г. Приговорена: ВТ в/ч 48240 13 сентября 1951 г., </w:t>
       </w:r>
       <w:proofErr w:type="spellStart"/>

</xml_diff>